<commit_message>
updated lab 2 doc file
</commit_message>
<xml_diff>
--- a/Lab 2/202612050.docx
+++ b/Lab 2/202612050.docx
@@ -109,27 +109,7 @@
             <w:sz w:val="22"/>
             <w:szCs w:val="24"/>
           </w:rPr>
-          <w:t>Kunal-63/20261205</w:t>
-        </w:r>
-        <w:r>
-          <w:rPr>
-            <w:rStyle w:val="Hyperlink"/>
-            <w:b/>
-            <w:bCs/>
-            <w:sz w:val="22"/>
-            <w:szCs w:val="24"/>
-          </w:rPr>
-          <w:t>0</w:t>
-        </w:r>
-        <w:r>
-          <w:rPr>
-            <w:rStyle w:val="Hyperlink"/>
-            <w:b/>
-            <w:bCs/>
-            <w:sz w:val="22"/>
-            <w:szCs w:val="24"/>
-          </w:rPr>
-          <w:t>-IT603</w:t>
+          <w:t>Kunal-63/202612050-IT603</w:t>
         </w:r>
       </w:hyperlink>
     </w:p>
@@ -400,6 +380,7 @@
         <w:rPr>
           <w:b/>
           <w:bCs/>
+          <w:noProof/>
           <w:sz w:val="22"/>
           <w:szCs w:val="24"/>
         </w:rPr>
@@ -452,21 +433,7 @@
           <w:sz w:val="22"/>
           <w:szCs w:val="24"/>
         </w:rPr>
-        <w:t xml:space="preserve">Stage 1 </w:t>
-      </w:r>
-      <w:r>
-        <w:rPr>
-          <w:sz w:val="22"/>
-          <w:szCs w:val="24"/>
-        </w:rPr>
-        <w:t xml:space="preserve">– </w:t>
-      </w:r>
-      <w:r>
-        <w:rPr>
-          <w:sz w:val="22"/>
-          <w:szCs w:val="24"/>
-        </w:rPr>
-        <w:t>Preprocessing</w:t>
+        <w:t>Stage 1 – Preprocessing</w:t>
       </w:r>
     </w:p>
     <w:p>
@@ -562,6 +529,7 @@
         <w:rPr>
           <w:b/>
           <w:bCs/>
+          <w:noProof/>
           <w:sz w:val="22"/>
           <w:szCs w:val="24"/>
         </w:rPr>
@@ -615,21 +583,7 @@
           <w:sz w:val="22"/>
           <w:szCs w:val="24"/>
         </w:rPr>
-        <w:t xml:space="preserve">Stage 2 </w:t>
-      </w:r>
-      <w:r>
-        <w:rPr>
-          <w:sz w:val="22"/>
-          <w:szCs w:val="24"/>
-        </w:rPr>
-        <w:t>–</w:t>
-      </w:r>
-      <w:r>
-        <w:rPr>
-          <w:sz w:val="22"/>
-          <w:szCs w:val="24"/>
-        </w:rPr>
-        <w:t xml:space="preserve"> Compilation</w:t>
+        <w:t>Stage 2 – Compilation</w:t>
       </w:r>
     </w:p>
     <w:p>
@@ -705,6 +659,7 @@
         <w:rPr>
           <w:b/>
           <w:bCs/>
+          <w:noProof/>
           <w:sz w:val="22"/>
           <w:szCs w:val="24"/>
         </w:rPr>
@@ -757,21 +712,7 @@
           <w:sz w:val="22"/>
           <w:szCs w:val="24"/>
         </w:rPr>
-        <w:t xml:space="preserve">Stage 3 </w:t>
-      </w:r>
-      <w:r>
-        <w:rPr>
-          <w:sz w:val="22"/>
-          <w:szCs w:val="24"/>
-        </w:rPr>
-        <w:t>–</w:t>
-      </w:r>
-      <w:r>
-        <w:rPr>
-          <w:sz w:val="22"/>
-          <w:szCs w:val="24"/>
-        </w:rPr>
-        <w:t xml:space="preserve"> Assembly</w:t>
+        <w:t>Stage 3 – Assembly</w:t>
       </w:r>
     </w:p>
     <w:p>
@@ -847,6 +788,7 @@
         <w:rPr>
           <w:b/>
           <w:bCs/>
+          <w:noProof/>
           <w:sz w:val="22"/>
           <w:szCs w:val="24"/>
         </w:rPr>
@@ -899,21 +841,7 @@
           <w:sz w:val="22"/>
           <w:szCs w:val="24"/>
         </w:rPr>
-        <w:t xml:space="preserve">Stage 4 </w:t>
-      </w:r>
-      <w:r>
-        <w:rPr>
-          <w:sz w:val="22"/>
-          <w:szCs w:val="24"/>
-        </w:rPr>
-        <w:t xml:space="preserve">- </w:t>
-      </w:r>
-      <w:r>
-        <w:rPr>
-          <w:sz w:val="22"/>
-          <w:szCs w:val="24"/>
-        </w:rPr>
-        <w:t xml:space="preserve"> Linking</w:t>
+        <w:t>Stage 4 -  Linking</w:t>
       </w:r>
     </w:p>
     <w:p>
@@ -953,7 +881,39 @@
           <w:sz w:val="22"/>
           <w:szCs w:val="24"/>
         </w:rPr>
-        <w:t xml:space="preserve">References to functions such as cout and cin are resolved. </w:t>
+        <w:t xml:space="preserve">References to functions such as </w:t>
+      </w:r>
+      <w:proofErr w:type="spellStart"/>
+      <w:r>
+        <w:rPr>
+          <w:sz w:val="22"/>
+          <w:szCs w:val="24"/>
+        </w:rPr>
+        <w:t>cout</w:t>
+      </w:r>
+      <w:proofErr w:type="spellEnd"/>
+      <w:r>
+        <w:rPr>
+          <w:sz w:val="22"/>
+          <w:szCs w:val="24"/>
+        </w:rPr>
+        <w:t xml:space="preserve"> and </w:t>
+      </w:r>
+      <w:proofErr w:type="spellStart"/>
+      <w:r>
+        <w:rPr>
+          <w:sz w:val="22"/>
+          <w:szCs w:val="24"/>
+        </w:rPr>
+        <w:t>cin</w:t>
+      </w:r>
+      <w:proofErr w:type="spellEnd"/>
+      <w:r>
+        <w:rPr>
+          <w:sz w:val="22"/>
+          <w:szCs w:val="24"/>
+        </w:rPr>
+        <w:t xml:space="preserve"> are resolved. </w:t>
       </w:r>
     </w:p>
     <w:p>
@@ -989,6 +949,7 @@
         <w:rPr>
           <w:b/>
           <w:bCs/>
+          <w:noProof/>
           <w:sz w:val="22"/>
           <w:szCs w:val="24"/>
         </w:rPr>
@@ -1042,6 +1003,7 @@
         <w:rPr>
           <w:b/>
           <w:bCs/>
+          <w:noProof/>
           <w:sz w:val="22"/>
           <w:szCs w:val="24"/>
         </w:rPr>
@@ -1085,17 +1047,20 @@
     </w:p>
     <w:p>
       <w:pPr>
-        <w:rPr>
-          <w:sz w:val="22"/>
-          <w:szCs w:val="24"/>
-        </w:rPr>
-      </w:pPr>
-      <w:r>
-        <w:rPr>
-          <w:sz w:val="22"/>
-          <w:szCs w:val="24"/>
-        </w:rPr>
-        <w:t>The compilation process transforms the C++ source code into preprocessed code, assembly code, object code, and finally an executable. The -O0 option produces minimally optimized code, while -O2 applies compiler optimizations that can improve execution performance and change the generated assembly.</w:t>
+        <w:pBdr>
+          <w:bottom w:val="single" w:sz="6" w:space="1" w:color="auto"/>
+        </w:pBdr>
+        <w:rPr>
+          <w:sz w:val="22"/>
+          <w:szCs w:val="24"/>
+        </w:rPr>
+      </w:pPr>
+      <w:r>
+        <w:rPr>
+          <w:sz w:val="22"/>
+          <w:szCs w:val="24"/>
+        </w:rPr>
+        <w:t>With -O0, the compiler performs minimal optimization, resulting in simpler and generally larger assembly code. With -O2, the compiler applies more optimizations such as reducing unnecessary instructions and improving execution efficiency. Therefore, the generated assembly can differ between the two optimization levels.</w:t>
       </w:r>
     </w:p>
     <w:p>
@@ -1408,6 +1373,7 @@
         <w:rPr>
           <w:b/>
           <w:bCs/>
+          <w:noProof/>
           <w:sz w:val="22"/>
           <w:szCs w:val="24"/>
         </w:rPr>
@@ -1462,6 +1428,7 @@
         <w:rPr>
           <w:b/>
           <w:bCs/>
+          <w:noProof/>
           <w:sz w:val="22"/>
           <w:szCs w:val="24"/>
         </w:rPr>
@@ -1516,6 +1483,7 @@
         <w:rPr>
           <w:b/>
           <w:bCs/>
+          <w:noProof/>
           <w:sz w:val="22"/>
           <w:szCs w:val="24"/>
         </w:rPr>
@@ -1638,7 +1606,27 @@
           <w:sz w:val="22"/>
           <w:szCs w:val="24"/>
         </w:rPr>
-        <w:t>Split a single-file program into multiple files: separate header (.h) and source (.cpp) files for</w:t>
+        <w:t>Split a single-file program into multiple files: separate header (.h) and source (.</w:t>
+      </w:r>
+      <w:proofErr w:type="spellStart"/>
+      <w:r>
+        <w:rPr>
+          <w:b/>
+          <w:bCs/>
+          <w:sz w:val="22"/>
+          <w:szCs w:val="24"/>
+        </w:rPr>
+        <w:t>cpp</w:t>
+      </w:r>
+      <w:proofErr w:type="spellEnd"/>
+      <w:r>
+        <w:rPr>
+          <w:b/>
+          <w:bCs/>
+          <w:sz w:val="22"/>
+          <w:szCs w:val="24"/>
+        </w:rPr>
+        <w:t>) files for</w:t>
       </w:r>
       <w:r>
         <w:rPr>
@@ -1762,6 +1750,7 @@
         <w:rPr>
           <w:b/>
           <w:bCs/>
+          <w:noProof/>
           <w:sz w:val="22"/>
           <w:szCs w:val="24"/>
         </w:rPr>
@@ -1989,8 +1978,19 @@
           <w:sz w:val="22"/>
           <w:szCs w:val="24"/>
         </w:rPr>
-        <w:t>4 Part D: Makefiles</w:t>
-      </w:r>
+        <w:t xml:space="preserve">4 Part D: </w:t>
+      </w:r>
+      <w:proofErr w:type="spellStart"/>
+      <w:r>
+        <w:rPr>
+          <w:b/>
+          <w:bCs/>
+          <w:sz w:val="22"/>
+          <w:szCs w:val="24"/>
+        </w:rPr>
+        <w:t>Makefiles</w:t>
+      </w:r>
+      <w:proofErr w:type="spellEnd"/>
     </w:p>
     <w:p>
       <w:pPr>
@@ -2033,7 +2033,27 @@
           <w:sz w:val="22"/>
           <w:szCs w:val="24"/>
         </w:rPr>
-        <w:t>Write a Makefile for the multi-file program from Part C.</w:t>
+        <w:t xml:space="preserve">Write a </w:t>
+      </w:r>
+      <w:proofErr w:type="spellStart"/>
+      <w:r>
+        <w:rPr>
+          <w:b/>
+          <w:bCs/>
+          <w:sz w:val="22"/>
+          <w:szCs w:val="24"/>
+        </w:rPr>
+        <w:t>Makefile</w:t>
+      </w:r>
+      <w:proofErr w:type="spellEnd"/>
+      <w:r>
+        <w:rPr>
+          <w:b/>
+          <w:bCs/>
+          <w:sz w:val="22"/>
+          <w:szCs w:val="24"/>
+        </w:rPr>
+        <w:t xml:space="preserve"> for the multi-file program from Part C.</w:t>
       </w:r>
     </w:p>
     <w:p>
@@ -2057,7 +2077,27 @@
           <w:sz w:val="22"/>
           <w:szCs w:val="24"/>
         </w:rPr>
-        <w:t>The Makefile should include:</w:t>
+        <w:t xml:space="preserve">The </w:t>
+      </w:r>
+      <w:proofErr w:type="spellStart"/>
+      <w:r>
+        <w:rPr>
+          <w:b/>
+          <w:bCs/>
+          <w:sz w:val="22"/>
+          <w:szCs w:val="24"/>
+        </w:rPr>
+        <w:t>Makefile</w:t>
+      </w:r>
+      <w:proofErr w:type="spellEnd"/>
+      <w:r>
+        <w:rPr>
+          <w:b/>
+          <w:bCs/>
+          <w:sz w:val="22"/>
+          <w:szCs w:val="24"/>
+        </w:rPr>
+        <w:t xml:space="preserve"> should include:</w:t>
       </w:r>
     </w:p>
     <w:p>
@@ -2193,6 +2233,7 @@
         <w:rPr>
           <w:b/>
           <w:bCs/>
+          <w:noProof/>
           <w:sz w:val="22"/>
           <w:szCs w:val="24"/>
         </w:rPr>
@@ -2246,6 +2287,7 @@
         <w:rPr>
           <w:b/>
           <w:bCs/>
+          <w:noProof/>
           <w:sz w:val="22"/>
           <w:szCs w:val="24"/>
         </w:rPr>
@@ -2393,7 +2435,27 @@
           <w:sz w:val="22"/>
           <w:szCs w:val="24"/>
         </w:rPr>
-        <w:t>Create a .gitignore file to exclude compiled binaries and object files.</w:t>
+        <w:t>Create a .</w:t>
+      </w:r>
+      <w:proofErr w:type="spellStart"/>
+      <w:r>
+        <w:rPr>
+          <w:b/>
+          <w:bCs/>
+          <w:sz w:val="22"/>
+          <w:szCs w:val="24"/>
+        </w:rPr>
+        <w:t>gitignore</w:t>
+      </w:r>
+      <w:proofErr w:type="spellEnd"/>
+      <w:r>
+        <w:rPr>
+          <w:b/>
+          <w:bCs/>
+          <w:sz w:val="22"/>
+          <w:szCs w:val="24"/>
+        </w:rPr>
+        <w:t xml:space="preserve"> file to exclude compiled binaries and object files.</w:t>
       </w:r>
     </w:p>
     <w:p>
@@ -2529,6 +2591,7 @@
         <w:rPr>
           <w:b/>
           <w:bCs/>
+          <w:noProof/>
           <w:sz w:val="22"/>
           <w:szCs w:val="24"/>
         </w:rPr>
@@ -2582,6 +2645,7 @@
         <w:rPr>
           <w:b/>
           <w:bCs/>
+          <w:noProof/>
           <w:sz w:val="22"/>
           <w:szCs w:val="24"/>
         </w:rPr>
@@ -2635,6 +2699,7 @@
         <w:rPr>
           <w:b/>
           <w:bCs/>
+          <w:noProof/>
           <w:sz w:val="22"/>
           <w:szCs w:val="24"/>
         </w:rPr>
@@ -2676,9 +2741,144 @@
         </w:drawing>
       </w:r>
     </w:p>
+    <w:p>
+      <w:pPr>
+        <w:rPr>
+          <w:sz w:val="22"/>
+          <w:szCs w:val="24"/>
+        </w:rPr>
+      </w:pPr>
+      <w:r>
+        <w:rPr>
+          <w:b/>
+          <w:bCs/>
+          <w:sz w:val="22"/>
+          <w:szCs w:val="24"/>
+        </w:rPr>
+        <w:t>git status</w:t>
+      </w:r>
+      <w:r>
+        <w:rPr>
+          <w:sz w:val="22"/>
+          <w:szCs w:val="24"/>
+        </w:rPr>
+        <w:t xml:space="preserve"> shows changed, staged, and untracked files.</w:t>
+      </w:r>
+    </w:p>
+    <w:p>
+      <w:pPr>
+        <w:rPr>
+          <w:sz w:val="22"/>
+          <w:szCs w:val="24"/>
+        </w:rPr>
+      </w:pPr>
+      <w:r>
+        <w:rPr>
+          <w:b/>
+          <w:bCs/>
+          <w:sz w:val="22"/>
+          <w:szCs w:val="24"/>
+        </w:rPr>
+        <w:t>git diff</w:t>
+      </w:r>
+      <w:r>
+        <w:rPr>
+          <w:sz w:val="22"/>
+          <w:szCs w:val="24"/>
+        </w:rPr>
+        <w:t xml:space="preserve"> shows </w:t>
+      </w:r>
+      <w:proofErr w:type="spellStart"/>
+      <w:r>
+        <w:rPr>
+          <w:sz w:val="22"/>
+          <w:szCs w:val="24"/>
+        </w:rPr>
+        <w:t>unstaged</w:t>
+      </w:r>
+      <w:proofErr w:type="spellEnd"/>
+      <w:r>
+        <w:rPr>
+          <w:sz w:val="22"/>
+          <w:szCs w:val="24"/>
+        </w:rPr>
+        <w:t xml:space="preserve"> code changes.</w:t>
+      </w:r>
+    </w:p>
+    <w:p>
+      <w:pPr>
+        <w:rPr>
+          <w:sz w:val="22"/>
+          <w:szCs w:val="24"/>
+        </w:rPr>
+      </w:pPr>
+      <w:r>
+        <w:rPr>
+          <w:b/>
+          <w:bCs/>
+          <w:sz w:val="22"/>
+          <w:szCs w:val="24"/>
+        </w:rPr>
+        <w:t>git checkout</w:t>
+      </w:r>
+      <w:r>
+        <w:rPr>
+          <w:sz w:val="22"/>
+          <w:szCs w:val="24"/>
+        </w:rPr>
+        <w:t xml:space="preserve"> switches branches; </w:t>
+      </w:r>
+      <w:r>
+        <w:rPr>
+          <w:b/>
+          <w:bCs/>
+          <w:sz w:val="22"/>
+          <w:szCs w:val="24"/>
+        </w:rPr>
+        <w:t>git checkout -b</w:t>
+      </w:r>
+      <w:r>
+        <w:rPr>
+          <w:sz w:val="22"/>
+          <w:szCs w:val="24"/>
+        </w:rPr>
+        <w:t xml:space="preserve"> creates and switches to a new branch.</w:t>
+      </w:r>
+    </w:p>
+    <w:p>
+      <w:pPr>
+        <w:rPr>
+          <w:b/>
+          <w:bCs/>
+          <w:sz w:val="22"/>
+          <w:szCs w:val="24"/>
+        </w:rPr>
+      </w:pPr>
+      <w:r>
+        <w:rPr>
+          <w:b/>
+          <w:bCs/>
+          <w:sz w:val="22"/>
+          <w:szCs w:val="24"/>
+        </w:rPr>
+        <w:t xml:space="preserve">GitHub Repo Link - </w:t>
+      </w:r>
+      <w:hyperlink r:id="rId24" w:history="1">
+        <w:r>
+          <w:rPr>
+            <w:rStyle w:val="Hyperlink"/>
+            <w:b/>
+            <w:bCs/>
+            <w:sz w:val="22"/>
+            <w:szCs w:val="24"/>
+          </w:rPr>
+          <w:t>Kunal-63/202612050-IT603</w:t>
+        </w:r>
+      </w:hyperlink>
+    </w:p>
     <w:sectPr>
-      <w:headerReference w:type="default" r:id="rId24"/>
-      <w:footerReference w:type="default" r:id="rId25"/>
+      <w:headerReference w:type="default" r:id="rId25"/>
+      <w:footerReference w:type="default" r:id="rId26"/>
       <w:pgSz w:w="12240" w:h="15840"/>
       <w:pgMar w:top="1440" w:right="1440" w:bottom="1440" w:left="1440" w:header="720" w:footer="720" w:gutter="0"/>
       <w:cols w:space="720"/>

</xml_diff>

<commit_message>
added source code of Makefile in doc file
</commit_message>
<xml_diff>
--- a/Lab 2/202612050.docx
+++ b/Lab 2/202612050.docx
@@ -841,8 +841,17 @@
           <w:sz w:val="22"/>
           <w:szCs w:val="24"/>
         </w:rPr>
-        <w:t>Stage 4 -  Linking</w:t>
-      </w:r>
+        <w:t xml:space="preserve">Stage 4 </w:t>
+      </w:r>
+      <w:proofErr w:type="gramStart"/>
+      <w:r>
+        <w:rPr>
+          <w:sz w:val="22"/>
+          <w:szCs w:val="24"/>
+        </w:rPr>
+        <w:t>-  Linking</w:t>
+      </w:r>
+      <w:proofErr w:type="gramEnd"/>
     </w:p>
     <w:p>
       <w:pPr>
@@ -2330,6 +2339,79 @@
     </w:p>
     <w:p>
       <w:pPr>
+        <w:rPr>
+          <w:b/>
+          <w:bCs/>
+          <w:sz w:val="22"/>
+          <w:szCs w:val="24"/>
+        </w:rPr>
+      </w:pPr>
+      <w:r>
+        <w:rPr>
+          <w:b/>
+          <w:bCs/>
+          <w:sz w:val="22"/>
+          <w:szCs w:val="24"/>
+        </w:rPr>
+        <w:t xml:space="preserve">Source Code of </w:t>
+      </w:r>
+      <w:proofErr w:type="spellStart"/>
+      <w:r>
+        <w:rPr>
+          <w:b/>
+          <w:bCs/>
+          <w:sz w:val="22"/>
+          <w:szCs w:val="24"/>
+        </w:rPr>
+        <w:t>Makefile</w:t>
+      </w:r>
+      <w:proofErr w:type="spellEnd"/>
+      <w:r>
+        <w:rPr>
+          <w:b/>
+          <w:bCs/>
+          <w:sz w:val="22"/>
+          <w:szCs w:val="24"/>
+        </w:rPr>
+        <w:t xml:space="preserve"> - </w:t>
+      </w:r>
+      <w:hyperlink r:id="rId21" w:history="1">
+        <w:r>
+          <w:rPr>
+            <w:rStyle w:val="Hyperlink"/>
+            <w:b/>
+            <w:bCs/>
+            <w:sz w:val="22"/>
+            <w:szCs w:val="24"/>
+          </w:rPr>
+          <w:t>202612050-IT603/Lab 2/part c d/</w:t>
+        </w:r>
+        <w:proofErr w:type="spellStart"/>
+        <w:r>
+          <w:rPr>
+            <w:rStyle w:val="Hyperlink"/>
+            <w:b/>
+            <w:bCs/>
+            <w:sz w:val="22"/>
+            <w:szCs w:val="24"/>
+          </w:rPr>
+          <w:t>Makefile</w:t>
+        </w:r>
+        <w:proofErr w:type="spellEnd"/>
+        <w:r>
+          <w:rPr>
+            <w:rStyle w:val="Hyperlink"/>
+            <w:b/>
+            <w:bCs/>
+            <w:sz w:val="22"/>
+            <w:szCs w:val="24"/>
+          </w:rPr>
+          <w:t xml:space="preserve"> at master · Kunal-63/202612050-IT603</w:t>
+        </w:r>
+      </w:hyperlink>
+    </w:p>
+    <w:p>
+      <w:pPr>
         <w:pBdr>
           <w:bottom w:val="single" w:sz="6" w:space="1" w:color="auto"/>
         </w:pBdr>
@@ -2386,6 +2468,7 @@
           <w:sz w:val="22"/>
           <w:szCs w:val="24"/>
         </w:rPr>
+        <w:lastRenderedPageBreak/>
         <w:t>What to do</w:t>
       </w:r>
     </w:p>
@@ -2410,7 +2493,6 @@
           <w:sz w:val="22"/>
           <w:szCs w:val="24"/>
         </w:rPr>
-        <w:lastRenderedPageBreak/>
         <w:t>Initialize a Git repository for the project from Parts C and D.</w:t>
       </w:r>
     </w:p>
@@ -2435,7 +2517,17 @@
           <w:sz w:val="22"/>
           <w:szCs w:val="24"/>
         </w:rPr>
-        <w:t>Create a .</w:t>
+        <w:t xml:space="preserve">Create </w:t>
+      </w:r>
+      <w:proofErr w:type="gramStart"/>
+      <w:r>
+        <w:rPr>
+          <w:b/>
+          <w:bCs/>
+          <w:sz w:val="22"/>
+          <w:szCs w:val="24"/>
+        </w:rPr>
+        <w:t>a .</w:t>
       </w:r>
       <w:proofErr w:type="spellStart"/>
       <w:r>
@@ -2448,6 +2540,7 @@
         <w:t>gitignore</w:t>
       </w:r>
       <w:proofErr w:type="spellEnd"/>
+      <w:proofErr w:type="gramEnd"/>
       <w:r>
         <w:rPr>
           <w:b/>
@@ -2611,7 +2704,7 @@
                     <pic:cNvPicPr/>
                   </pic:nvPicPr>
                   <pic:blipFill>
-                    <a:blip r:embed="rId21"/>
+                    <a:blip r:embed="rId22"/>
                     <a:stretch>
                       <a:fillRect/>
                     </a:stretch>
@@ -2665,7 +2758,7 @@
                     <pic:cNvPicPr/>
                   </pic:nvPicPr>
                   <pic:blipFill>
-                    <a:blip r:embed="rId22"/>
+                    <a:blip r:embed="rId23"/>
                     <a:stretch>
                       <a:fillRect/>
                     </a:stretch>
@@ -2720,7 +2813,7 @@
                     <pic:cNvPicPr/>
                   </pic:nvPicPr>
                   <pic:blipFill>
-                    <a:blip r:embed="rId23"/>
+                    <a:blip r:embed="rId24"/>
                     <a:stretch>
                       <a:fillRect/>
                     </a:stretch>
@@ -2863,7 +2956,7 @@
         </w:rPr>
         <w:t xml:space="preserve">GitHub Repo Link - </w:t>
       </w:r>
-      <w:hyperlink r:id="rId24" w:history="1">
+      <w:hyperlink r:id="rId25" w:history="1">
         <w:r>
           <w:rPr>
             <w:rStyle w:val="Hyperlink"/>
@@ -2877,8 +2970,8 @@
       </w:hyperlink>
     </w:p>
     <w:sectPr>
-      <w:headerReference w:type="default" r:id="rId25"/>
-      <w:footerReference w:type="default" r:id="rId26"/>
+      <w:headerReference w:type="default" r:id="rId26"/>
+      <w:footerReference w:type="default" r:id="rId27"/>
       <w:pgSz w:w="12240" w:h="15840"/>
       <w:pgMar w:top="1440" w:right="1440" w:bottom="1440" w:left="1440" w:header="720" w:footer="720" w:gutter="0"/>
       <w:cols w:space="720"/>

</xml_diff>

<commit_message>
added source code of the files
</commit_message>
<xml_diff>
--- a/Lab 2/202612050.docx
+++ b/Lab 2/202612050.docx
@@ -2412,6 +2412,1106 @@
     </w:p>
     <w:p>
       <w:pPr>
+        <w:shd w:val="clear" w:color="auto" w:fill="1F1F1F"/>
+        <w:spacing w:after="0" w:line="285" w:lineRule="atLeast"/>
+        <w:rPr>
+          <w:rFonts w:ascii="Consolas" w:eastAsia="Times New Roman" w:hAnsi="Consolas" w:cs="Times New Roman"/>
+          <w:color w:val="CCCCCC"/>
+          <w:kern w:val="0"/>
+          <w:sz w:val="21"/>
+          <w:szCs w:val="21"/>
+          <w:lang w:bidi="gu-IN"/>
+          <w14:ligatures w14:val="none"/>
+        </w:rPr>
+      </w:pPr>
+      <w:r>
+        <w:rPr>
+          <w:rFonts w:ascii="Consolas" w:eastAsia="Times New Roman" w:hAnsi="Consolas" w:cs="Times New Roman"/>
+          <w:color w:val="9CDCFE"/>
+          <w:kern w:val="0"/>
+          <w:sz w:val="21"/>
+          <w:szCs w:val="21"/>
+          <w:lang w:bidi="gu-IN"/>
+          <w14:ligatures w14:val="none"/>
+        </w:rPr>
+        <w:t>CXX</w:t>
+      </w:r>
+      <w:r>
+        <w:rPr>
+          <w:rFonts w:ascii="Consolas" w:eastAsia="Times New Roman" w:hAnsi="Consolas" w:cs="Times New Roman"/>
+          <w:color w:val="CCCCCC"/>
+          <w:kern w:val="0"/>
+          <w:sz w:val="21"/>
+          <w:szCs w:val="21"/>
+          <w:lang w:bidi="gu-IN"/>
+          <w14:ligatures w14:val="none"/>
+        </w:rPr>
+        <w:t xml:space="preserve"> = g++</w:t>
+      </w:r>
+    </w:p>
+    <w:p>
+      <w:pPr>
+        <w:shd w:val="clear" w:color="auto" w:fill="1F1F1F"/>
+        <w:spacing w:after="0" w:line="285" w:lineRule="atLeast"/>
+        <w:rPr>
+          <w:rFonts w:ascii="Consolas" w:eastAsia="Times New Roman" w:hAnsi="Consolas" w:cs="Times New Roman"/>
+          <w:color w:val="CCCCCC"/>
+          <w:kern w:val="0"/>
+          <w:sz w:val="21"/>
+          <w:szCs w:val="21"/>
+          <w:lang w:bidi="gu-IN"/>
+          <w14:ligatures w14:val="none"/>
+        </w:rPr>
+      </w:pPr>
+      <w:r>
+        <w:rPr>
+          <w:rFonts w:ascii="Consolas" w:eastAsia="Times New Roman" w:hAnsi="Consolas" w:cs="Times New Roman"/>
+          <w:color w:val="9CDCFE"/>
+          <w:kern w:val="0"/>
+          <w:sz w:val="21"/>
+          <w:szCs w:val="21"/>
+          <w:lang w:bidi="gu-IN"/>
+          <w14:ligatures w14:val="none"/>
+        </w:rPr>
+        <w:t>CXXFLAGS</w:t>
+      </w:r>
+      <w:r>
+        <w:rPr>
+          <w:rFonts w:ascii="Consolas" w:eastAsia="Times New Roman" w:hAnsi="Consolas" w:cs="Times New Roman"/>
+          <w:color w:val="CCCCCC"/>
+          <w:kern w:val="0"/>
+          <w:sz w:val="21"/>
+          <w:szCs w:val="21"/>
+          <w:lang w:bidi="gu-IN"/>
+          <w14:ligatures w14:val="none"/>
+        </w:rPr>
+        <w:t xml:space="preserve"> = -Wall -g</w:t>
+      </w:r>
+    </w:p>
+    <w:p>
+      <w:pPr>
+        <w:shd w:val="clear" w:color="auto" w:fill="1F1F1F"/>
+        <w:spacing w:after="0" w:line="285" w:lineRule="atLeast"/>
+        <w:rPr>
+          <w:rFonts w:ascii="Consolas" w:eastAsia="Times New Roman" w:hAnsi="Consolas" w:cs="Times New Roman"/>
+          <w:color w:val="CCCCCC"/>
+          <w:kern w:val="0"/>
+          <w:sz w:val="21"/>
+          <w:szCs w:val="21"/>
+          <w:lang w:bidi="gu-IN"/>
+          <w14:ligatures w14:val="none"/>
+        </w:rPr>
+      </w:pPr>
+    </w:p>
+    <w:p>
+      <w:pPr>
+        <w:shd w:val="clear" w:color="auto" w:fill="1F1F1F"/>
+        <w:spacing w:after="0" w:line="285" w:lineRule="atLeast"/>
+        <w:rPr>
+          <w:rFonts w:ascii="Consolas" w:eastAsia="Times New Roman" w:hAnsi="Consolas" w:cs="Times New Roman"/>
+          <w:color w:val="CCCCCC"/>
+          <w:kern w:val="0"/>
+          <w:sz w:val="21"/>
+          <w:szCs w:val="21"/>
+          <w:lang w:bidi="gu-IN"/>
+          <w14:ligatures w14:val="none"/>
+        </w:rPr>
+      </w:pPr>
+      <w:r>
+        <w:rPr>
+          <w:rFonts w:ascii="Consolas" w:eastAsia="Times New Roman" w:hAnsi="Consolas" w:cs="Times New Roman"/>
+          <w:color w:val="9CDCFE"/>
+          <w:kern w:val="0"/>
+          <w:sz w:val="21"/>
+          <w:szCs w:val="21"/>
+          <w:lang w:bidi="gu-IN"/>
+          <w14:ligatures w14:val="none"/>
+        </w:rPr>
+        <w:t>TARGET</w:t>
+      </w:r>
+      <w:r>
+        <w:rPr>
+          <w:rFonts w:ascii="Consolas" w:eastAsia="Times New Roman" w:hAnsi="Consolas" w:cs="Times New Roman"/>
+          <w:color w:val="CCCCCC"/>
+          <w:kern w:val="0"/>
+          <w:sz w:val="21"/>
+          <w:szCs w:val="21"/>
+          <w:lang w:bidi="gu-IN"/>
+          <w14:ligatures w14:val="none"/>
+        </w:rPr>
+        <w:t xml:space="preserve"> = </w:t>
+      </w:r>
+      <w:proofErr w:type="spellStart"/>
+      <w:r>
+        <w:rPr>
+          <w:rFonts w:ascii="Consolas" w:eastAsia="Times New Roman" w:hAnsi="Consolas" w:cs="Times New Roman"/>
+          <w:color w:val="CCCCCC"/>
+          <w:kern w:val="0"/>
+          <w:sz w:val="21"/>
+          <w:szCs w:val="21"/>
+          <w:lang w:bidi="gu-IN"/>
+          <w14:ligatures w14:val="none"/>
+        </w:rPr>
+        <w:t>student_program</w:t>
+      </w:r>
+      <w:proofErr w:type="spellEnd"/>
+    </w:p>
+    <w:p>
+      <w:pPr>
+        <w:shd w:val="clear" w:color="auto" w:fill="1F1F1F"/>
+        <w:spacing w:after="0" w:line="285" w:lineRule="atLeast"/>
+        <w:rPr>
+          <w:rFonts w:ascii="Consolas" w:eastAsia="Times New Roman" w:hAnsi="Consolas" w:cs="Times New Roman"/>
+          <w:color w:val="CCCCCC"/>
+          <w:kern w:val="0"/>
+          <w:sz w:val="21"/>
+          <w:szCs w:val="21"/>
+          <w:lang w:bidi="gu-IN"/>
+          <w14:ligatures w14:val="none"/>
+        </w:rPr>
+      </w:pPr>
+      <w:r>
+        <w:rPr>
+          <w:rFonts w:ascii="Consolas" w:eastAsia="Times New Roman" w:hAnsi="Consolas" w:cs="Times New Roman"/>
+          <w:color w:val="9CDCFE"/>
+          <w:kern w:val="0"/>
+          <w:sz w:val="21"/>
+          <w:szCs w:val="21"/>
+          <w:lang w:bidi="gu-IN"/>
+          <w14:ligatures w14:val="none"/>
+        </w:rPr>
+        <w:lastRenderedPageBreak/>
+        <w:t>OBJS</w:t>
+      </w:r>
+      <w:r>
+        <w:rPr>
+          <w:rFonts w:ascii="Consolas" w:eastAsia="Times New Roman" w:hAnsi="Consolas" w:cs="Times New Roman"/>
+          <w:color w:val="CCCCCC"/>
+          <w:kern w:val="0"/>
+          <w:sz w:val="21"/>
+          <w:szCs w:val="21"/>
+          <w:lang w:bidi="gu-IN"/>
+          <w14:ligatures w14:val="none"/>
+        </w:rPr>
+        <w:t xml:space="preserve"> = </w:t>
+      </w:r>
+      <w:proofErr w:type="spellStart"/>
+      <w:proofErr w:type="gramStart"/>
+      <w:r>
+        <w:rPr>
+          <w:rFonts w:ascii="Consolas" w:eastAsia="Times New Roman" w:hAnsi="Consolas" w:cs="Times New Roman"/>
+          <w:color w:val="CCCCCC"/>
+          <w:kern w:val="0"/>
+          <w:sz w:val="21"/>
+          <w:szCs w:val="21"/>
+          <w:lang w:bidi="gu-IN"/>
+          <w14:ligatures w14:val="none"/>
+        </w:rPr>
+        <w:t>main.o</w:t>
+      </w:r>
+      <w:proofErr w:type="spellEnd"/>
+      <w:proofErr w:type="gramEnd"/>
+      <w:r>
+        <w:rPr>
+          <w:rFonts w:ascii="Consolas" w:eastAsia="Times New Roman" w:hAnsi="Consolas" w:cs="Times New Roman"/>
+          <w:color w:val="CCCCCC"/>
+          <w:kern w:val="0"/>
+          <w:sz w:val="21"/>
+          <w:szCs w:val="21"/>
+          <w:lang w:bidi="gu-IN"/>
+          <w14:ligatures w14:val="none"/>
+        </w:rPr>
+        <w:t xml:space="preserve"> </w:t>
+      </w:r>
+      <w:proofErr w:type="spellStart"/>
+      <w:proofErr w:type="gramStart"/>
+      <w:r>
+        <w:rPr>
+          <w:rFonts w:ascii="Consolas" w:eastAsia="Times New Roman" w:hAnsi="Consolas" w:cs="Times New Roman"/>
+          <w:color w:val="CCCCCC"/>
+          <w:kern w:val="0"/>
+          <w:sz w:val="21"/>
+          <w:szCs w:val="21"/>
+          <w:lang w:bidi="gu-IN"/>
+          <w14:ligatures w14:val="none"/>
+        </w:rPr>
+        <w:t>student.o</w:t>
+      </w:r>
+      <w:proofErr w:type="spellEnd"/>
+      <w:proofErr w:type="gramEnd"/>
+    </w:p>
+    <w:p>
+      <w:pPr>
+        <w:shd w:val="clear" w:color="auto" w:fill="1F1F1F"/>
+        <w:spacing w:after="0" w:line="285" w:lineRule="atLeast"/>
+        <w:rPr>
+          <w:rFonts w:ascii="Consolas" w:eastAsia="Times New Roman" w:hAnsi="Consolas" w:cs="Times New Roman"/>
+          <w:color w:val="CCCCCC"/>
+          <w:kern w:val="0"/>
+          <w:sz w:val="21"/>
+          <w:szCs w:val="21"/>
+          <w:lang w:bidi="gu-IN"/>
+          <w14:ligatures w14:val="none"/>
+        </w:rPr>
+      </w:pPr>
+    </w:p>
+    <w:p>
+      <w:pPr>
+        <w:shd w:val="clear" w:color="auto" w:fill="1F1F1F"/>
+        <w:spacing w:after="0" w:line="285" w:lineRule="atLeast"/>
+        <w:rPr>
+          <w:rFonts w:ascii="Consolas" w:eastAsia="Times New Roman" w:hAnsi="Consolas" w:cs="Times New Roman"/>
+          <w:color w:val="CCCCCC"/>
+          <w:kern w:val="0"/>
+          <w:sz w:val="21"/>
+          <w:szCs w:val="21"/>
+          <w:lang w:bidi="gu-IN"/>
+          <w14:ligatures w14:val="none"/>
+        </w:rPr>
+      </w:pPr>
+      <w:r>
+        <w:rPr>
+          <w:rFonts w:ascii="Consolas" w:eastAsia="Times New Roman" w:hAnsi="Consolas" w:cs="Times New Roman"/>
+          <w:color w:val="CE9178"/>
+          <w:kern w:val="0"/>
+          <w:sz w:val="21"/>
+          <w:szCs w:val="21"/>
+          <w:lang w:bidi="gu-IN"/>
+          <w14:ligatures w14:val="none"/>
+        </w:rPr>
+        <w:t>$(</w:t>
+      </w:r>
+      <w:r>
+        <w:rPr>
+          <w:rFonts w:ascii="Consolas" w:eastAsia="Times New Roman" w:hAnsi="Consolas" w:cs="Times New Roman"/>
+          <w:color w:val="9CDCFE"/>
+          <w:kern w:val="0"/>
+          <w:sz w:val="21"/>
+          <w:szCs w:val="21"/>
+          <w:lang w:bidi="gu-IN"/>
+          <w14:ligatures w14:val="none"/>
+        </w:rPr>
+        <w:t>TARGET</w:t>
+      </w:r>
+      <w:r>
+        <w:rPr>
+          <w:rFonts w:ascii="Consolas" w:eastAsia="Times New Roman" w:hAnsi="Consolas" w:cs="Times New Roman"/>
+          <w:color w:val="CE9178"/>
+          <w:kern w:val="0"/>
+          <w:sz w:val="21"/>
+          <w:szCs w:val="21"/>
+          <w:lang w:bidi="gu-IN"/>
+          <w14:ligatures w14:val="none"/>
+        </w:rPr>
+        <w:t>)</w:t>
+      </w:r>
+      <w:r>
+        <w:rPr>
+          <w:rFonts w:ascii="Consolas" w:eastAsia="Times New Roman" w:hAnsi="Consolas" w:cs="Times New Roman"/>
+          <w:color w:val="CCCCCC"/>
+          <w:kern w:val="0"/>
+          <w:sz w:val="21"/>
+          <w:szCs w:val="21"/>
+          <w:lang w:bidi="gu-IN"/>
+          <w14:ligatures w14:val="none"/>
+        </w:rPr>
+        <w:t xml:space="preserve">: </w:t>
+      </w:r>
+      <w:r>
+        <w:rPr>
+          <w:rFonts w:ascii="Consolas" w:eastAsia="Times New Roman" w:hAnsi="Consolas" w:cs="Times New Roman"/>
+          <w:color w:val="CE9178"/>
+          <w:kern w:val="0"/>
+          <w:sz w:val="21"/>
+          <w:szCs w:val="21"/>
+          <w:lang w:bidi="gu-IN"/>
+          <w14:ligatures w14:val="none"/>
+        </w:rPr>
+        <w:t>$(</w:t>
+      </w:r>
+      <w:r>
+        <w:rPr>
+          <w:rFonts w:ascii="Consolas" w:eastAsia="Times New Roman" w:hAnsi="Consolas" w:cs="Times New Roman"/>
+          <w:color w:val="9CDCFE"/>
+          <w:kern w:val="0"/>
+          <w:sz w:val="21"/>
+          <w:szCs w:val="21"/>
+          <w:lang w:bidi="gu-IN"/>
+          <w14:ligatures w14:val="none"/>
+        </w:rPr>
+        <w:t>OBJS</w:t>
+      </w:r>
+      <w:r>
+        <w:rPr>
+          <w:rFonts w:ascii="Consolas" w:eastAsia="Times New Roman" w:hAnsi="Consolas" w:cs="Times New Roman"/>
+          <w:color w:val="CE9178"/>
+          <w:kern w:val="0"/>
+          <w:sz w:val="21"/>
+          <w:szCs w:val="21"/>
+          <w:lang w:bidi="gu-IN"/>
+          <w14:ligatures w14:val="none"/>
+        </w:rPr>
+        <w:t>)</w:t>
+      </w:r>
+    </w:p>
+    <w:p>
+      <w:pPr>
+        <w:shd w:val="clear" w:color="auto" w:fill="1F1F1F"/>
+        <w:spacing w:after="0" w:line="285" w:lineRule="atLeast"/>
+        <w:rPr>
+          <w:rFonts w:ascii="Consolas" w:eastAsia="Times New Roman" w:hAnsi="Consolas" w:cs="Times New Roman"/>
+          <w:color w:val="CCCCCC"/>
+          <w:kern w:val="0"/>
+          <w:sz w:val="21"/>
+          <w:szCs w:val="21"/>
+          <w:lang w:bidi="gu-IN"/>
+          <w14:ligatures w14:val="none"/>
+        </w:rPr>
+      </w:pPr>
+      <w:r>
+        <w:rPr>
+          <w:rFonts w:ascii="Consolas" w:eastAsia="Times New Roman" w:hAnsi="Consolas" w:cs="Times New Roman"/>
+          <w:color w:val="CCCCCC"/>
+          <w:kern w:val="0"/>
+          <w:sz w:val="21"/>
+          <w:szCs w:val="21"/>
+          <w:lang w:bidi="gu-IN"/>
+          <w14:ligatures w14:val="none"/>
+        </w:rPr>
+        <w:t xml:space="preserve">    </w:t>
+      </w:r>
+      <w:r>
+        <w:rPr>
+          <w:rFonts w:ascii="Consolas" w:eastAsia="Times New Roman" w:hAnsi="Consolas" w:cs="Times New Roman"/>
+          <w:color w:val="CE9178"/>
+          <w:kern w:val="0"/>
+          <w:sz w:val="21"/>
+          <w:szCs w:val="21"/>
+          <w:lang w:bidi="gu-IN"/>
+          <w14:ligatures w14:val="none"/>
+        </w:rPr>
+        <w:t>$(</w:t>
+      </w:r>
+      <w:r>
+        <w:rPr>
+          <w:rFonts w:ascii="Consolas" w:eastAsia="Times New Roman" w:hAnsi="Consolas" w:cs="Times New Roman"/>
+          <w:color w:val="9CDCFE"/>
+          <w:kern w:val="0"/>
+          <w:sz w:val="21"/>
+          <w:szCs w:val="21"/>
+          <w:lang w:bidi="gu-IN"/>
+          <w14:ligatures w14:val="none"/>
+        </w:rPr>
+        <w:t>CXX</w:t>
+      </w:r>
+      <w:r>
+        <w:rPr>
+          <w:rFonts w:ascii="Consolas" w:eastAsia="Times New Roman" w:hAnsi="Consolas" w:cs="Times New Roman"/>
+          <w:color w:val="CE9178"/>
+          <w:kern w:val="0"/>
+          <w:sz w:val="21"/>
+          <w:szCs w:val="21"/>
+          <w:lang w:bidi="gu-IN"/>
+          <w14:ligatures w14:val="none"/>
+        </w:rPr>
+        <w:t>)</w:t>
+      </w:r>
+      <w:r>
+        <w:rPr>
+          <w:rFonts w:ascii="Consolas" w:eastAsia="Times New Roman" w:hAnsi="Consolas" w:cs="Times New Roman"/>
+          <w:color w:val="CCCCCC"/>
+          <w:kern w:val="0"/>
+          <w:sz w:val="21"/>
+          <w:szCs w:val="21"/>
+          <w:lang w:bidi="gu-IN"/>
+          <w14:ligatures w14:val="none"/>
+        </w:rPr>
+        <w:t xml:space="preserve"> </w:t>
+      </w:r>
+      <w:r>
+        <w:rPr>
+          <w:rFonts w:ascii="Consolas" w:eastAsia="Times New Roman" w:hAnsi="Consolas" w:cs="Times New Roman"/>
+          <w:color w:val="CE9178"/>
+          <w:kern w:val="0"/>
+          <w:sz w:val="21"/>
+          <w:szCs w:val="21"/>
+          <w:lang w:bidi="gu-IN"/>
+          <w14:ligatures w14:val="none"/>
+        </w:rPr>
+        <w:t>$(</w:t>
+      </w:r>
+      <w:r>
+        <w:rPr>
+          <w:rFonts w:ascii="Consolas" w:eastAsia="Times New Roman" w:hAnsi="Consolas" w:cs="Times New Roman"/>
+          <w:color w:val="9CDCFE"/>
+          <w:kern w:val="0"/>
+          <w:sz w:val="21"/>
+          <w:szCs w:val="21"/>
+          <w:lang w:bidi="gu-IN"/>
+          <w14:ligatures w14:val="none"/>
+        </w:rPr>
+        <w:t>OBJS</w:t>
+      </w:r>
+      <w:r>
+        <w:rPr>
+          <w:rFonts w:ascii="Consolas" w:eastAsia="Times New Roman" w:hAnsi="Consolas" w:cs="Times New Roman"/>
+          <w:color w:val="CE9178"/>
+          <w:kern w:val="0"/>
+          <w:sz w:val="21"/>
+          <w:szCs w:val="21"/>
+          <w:lang w:bidi="gu-IN"/>
+          <w14:ligatures w14:val="none"/>
+        </w:rPr>
+        <w:t>)</w:t>
+      </w:r>
+      <w:r>
+        <w:rPr>
+          <w:rFonts w:ascii="Consolas" w:eastAsia="Times New Roman" w:hAnsi="Consolas" w:cs="Times New Roman"/>
+          <w:color w:val="CCCCCC"/>
+          <w:kern w:val="0"/>
+          <w:sz w:val="21"/>
+          <w:szCs w:val="21"/>
+          <w:lang w:bidi="gu-IN"/>
+          <w14:ligatures w14:val="none"/>
+        </w:rPr>
+        <w:t xml:space="preserve"> -o </w:t>
+      </w:r>
+      <w:r>
+        <w:rPr>
+          <w:rFonts w:ascii="Consolas" w:eastAsia="Times New Roman" w:hAnsi="Consolas" w:cs="Times New Roman"/>
+          <w:color w:val="CE9178"/>
+          <w:kern w:val="0"/>
+          <w:sz w:val="21"/>
+          <w:szCs w:val="21"/>
+          <w:lang w:bidi="gu-IN"/>
+          <w14:ligatures w14:val="none"/>
+        </w:rPr>
+        <w:t>$(</w:t>
+      </w:r>
+      <w:r>
+        <w:rPr>
+          <w:rFonts w:ascii="Consolas" w:eastAsia="Times New Roman" w:hAnsi="Consolas" w:cs="Times New Roman"/>
+          <w:color w:val="9CDCFE"/>
+          <w:kern w:val="0"/>
+          <w:sz w:val="21"/>
+          <w:szCs w:val="21"/>
+          <w:lang w:bidi="gu-IN"/>
+          <w14:ligatures w14:val="none"/>
+        </w:rPr>
+        <w:t>TARGET</w:t>
+      </w:r>
+      <w:r>
+        <w:rPr>
+          <w:rFonts w:ascii="Consolas" w:eastAsia="Times New Roman" w:hAnsi="Consolas" w:cs="Times New Roman"/>
+          <w:color w:val="CE9178"/>
+          <w:kern w:val="0"/>
+          <w:sz w:val="21"/>
+          <w:szCs w:val="21"/>
+          <w:lang w:bidi="gu-IN"/>
+          <w14:ligatures w14:val="none"/>
+        </w:rPr>
+        <w:t>)</w:t>
+      </w:r>
+    </w:p>
+    <w:p>
+      <w:pPr>
+        <w:shd w:val="clear" w:color="auto" w:fill="1F1F1F"/>
+        <w:spacing w:after="0" w:line="285" w:lineRule="atLeast"/>
+        <w:rPr>
+          <w:rFonts w:ascii="Consolas" w:eastAsia="Times New Roman" w:hAnsi="Consolas" w:cs="Times New Roman"/>
+          <w:color w:val="CCCCCC"/>
+          <w:kern w:val="0"/>
+          <w:sz w:val="21"/>
+          <w:szCs w:val="21"/>
+          <w:lang w:bidi="gu-IN"/>
+          <w14:ligatures w14:val="none"/>
+        </w:rPr>
+      </w:pPr>
+    </w:p>
+    <w:p>
+      <w:pPr>
+        <w:shd w:val="clear" w:color="auto" w:fill="1F1F1F"/>
+        <w:spacing w:after="0" w:line="285" w:lineRule="atLeast"/>
+        <w:rPr>
+          <w:rFonts w:ascii="Consolas" w:eastAsia="Times New Roman" w:hAnsi="Consolas" w:cs="Times New Roman"/>
+          <w:color w:val="CCCCCC"/>
+          <w:kern w:val="0"/>
+          <w:sz w:val="21"/>
+          <w:szCs w:val="21"/>
+          <w:lang w:bidi="gu-IN"/>
+          <w14:ligatures w14:val="none"/>
+        </w:rPr>
+      </w:pPr>
+      <w:proofErr w:type="spellStart"/>
+      <w:proofErr w:type="gramStart"/>
+      <w:r>
+        <w:rPr>
+          <w:rFonts w:ascii="Consolas" w:eastAsia="Times New Roman" w:hAnsi="Consolas" w:cs="Times New Roman"/>
+          <w:color w:val="DCDCAA"/>
+          <w:kern w:val="0"/>
+          <w:sz w:val="21"/>
+          <w:szCs w:val="21"/>
+          <w:lang w:bidi="gu-IN"/>
+          <w14:ligatures w14:val="none"/>
+        </w:rPr>
+        <w:t>main.o</w:t>
+      </w:r>
+      <w:proofErr w:type="spellEnd"/>
+      <w:proofErr w:type="gramEnd"/>
+      <w:r>
+        <w:rPr>
+          <w:rFonts w:ascii="Consolas" w:eastAsia="Times New Roman" w:hAnsi="Consolas" w:cs="Times New Roman"/>
+          <w:color w:val="CCCCCC"/>
+          <w:kern w:val="0"/>
+          <w:sz w:val="21"/>
+          <w:szCs w:val="21"/>
+          <w:lang w:bidi="gu-IN"/>
+          <w14:ligatures w14:val="none"/>
+        </w:rPr>
+        <w:t xml:space="preserve">: main.cpp </w:t>
+      </w:r>
+      <w:proofErr w:type="spellStart"/>
+      <w:r>
+        <w:rPr>
+          <w:rFonts w:ascii="Consolas" w:eastAsia="Times New Roman" w:hAnsi="Consolas" w:cs="Times New Roman"/>
+          <w:color w:val="CCCCCC"/>
+          <w:kern w:val="0"/>
+          <w:sz w:val="21"/>
+          <w:szCs w:val="21"/>
+          <w:lang w:bidi="gu-IN"/>
+          <w14:ligatures w14:val="none"/>
+        </w:rPr>
+        <w:t>student.h</w:t>
+      </w:r>
+      <w:proofErr w:type="spellEnd"/>
+    </w:p>
+    <w:p>
+      <w:pPr>
+        <w:shd w:val="clear" w:color="auto" w:fill="1F1F1F"/>
+        <w:spacing w:after="0" w:line="285" w:lineRule="atLeast"/>
+        <w:rPr>
+          <w:rFonts w:ascii="Consolas" w:eastAsia="Times New Roman" w:hAnsi="Consolas" w:cs="Times New Roman"/>
+          <w:color w:val="CCCCCC"/>
+          <w:kern w:val="0"/>
+          <w:sz w:val="21"/>
+          <w:szCs w:val="21"/>
+          <w:lang w:bidi="gu-IN"/>
+          <w14:ligatures w14:val="none"/>
+        </w:rPr>
+      </w:pPr>
+      <w:r>
+        <w:rPr>
+          <w:rFonts w:ascii="Consolas" w:eastAsia="Times New Roman" w:hAnsi="Consolas" w:cs="Times New Roman"/>
+          <w:color w:val="CCCCCC"/>
+          <w:kern w:val="0"/>
+          <w:sz w:val="21"/>
+          <w:szCs w:val="21"/>
+          <w:lang w:bidi="gu-IN"/>
+          <w14:ligatures w14:val="none"/>
+        </w:rPr>
+        <w:t xml:space="preserve">    </w:t>
+      </w:r>
+      <w:r>
+        <w:rPr>
+          <w:rFonts w:ascii="Consolas" w:eastAsia="Times New Roman" w:hAnsi="Consolas" w:cs="Times New Roman"/>
+          <w:color w:val="CE9178"/>
+          <w:kern w:val="0"/>
+          <w:sz w:val="21"/>
+          <w:szCs w:val="21"/>
+          <w:lang w:bidi="gu-IN"/>
+          <w14:ligatures w14:val="none"/>
+        </w:rPr>
+        <w:t>$(</w:t>
+      </w:r>
+      <w:r>
+        <w:rPr>
+          <w:rFonts w:ascii="Consolas" w:eastAsia="Times New Roman" w:hAnsi="Consolas" w:cs="Times New Roman"/>
+          <w:color w:val="9CDCFE"/>
+          <w:kern w:val="0"/>
+          <w:sz w:val="21"/>
+          <w:szCs w:val="21"/>
+          <w:lang w:bidi="gu-IN"/>
+          <w14:ligatures w14:val="none"/>
+        </w:rPr>
+        <w:t>CXX</w:t>
+      </w:r>
+      <w:r>
+        <w:rPr>
+          <w:rFonts w:ascii="Consolas" w:eastAsia="Times New Roman" w:hAnsi="Consolas" w:cs="Times New Roman"/>
+          <w:color w:val="CE9178"/>
+          <w:kern w:val="0"/>
+          <w:sz w:val="21"/>
+          <w:szCs w:val="21"/>
+          <w:lang w:bidi="gu-IN"/>
+          <w14:ligatures w14:val="none"/>
+        </w:rPr>
+        <w:t>)</w:t>
+      </w:r>
+      <w:r>
+        <w:rPr>
+          <w:rFonts w:ascii="Consolas" w:eastAsia="Times New Roman" w:hAnsi="Consolas" w:cs="Times New Roman"/>
+          <w:color w:val="CCCCCC"/>
+          <w:kern w:val="0"/>
+          <w:sz w:val="21"/>
+          <w:szCs w:val="21"/>
+          <w:lang w:bidi="gu-IN"/>
+          <w14:ligatures w14:val="none"/>
+        </w:rPr>
+        <w:t xml:space="preserve"> </w:t>
+      </w:r>
+      <w:r>
+        <w:rPr>
+          <w:rFonts w:ascii="Consolas" w:eastAsia="Times New Roman" w:hAnsi="Consolas" w:cs="Times New Roman"/>
+          <w:color w:val="CE9178"/>
+          <w:kern w:val="0"/>
+          <w:sz w:val="21"/>
+          <w:szCs w:val="21"/>
+          <w:lang w:bidi="gu-IN"/>
+          <w14:ligatures w14:val="none"/>
+        </w:rPr>
+        <w:t>$(</w:t>
+      </w:r>
+      <w:r>
+        <w:rPr>
+          <w:rFonts w:ascii="Consolas" w:eastAsia="Times New Roman" w:hAnsi="Consolas" w:cs="Times New Roman"/>
+          <w:color w:val="9CDCFE"/>
+          <w:kern w:val="0"/>
+          <w:sz w:val="21"/>
+          <w:szCs w:val="21"/>
+          <w:lang w:bidi="gu-IN"/>
+          <w14:ligatures w14:val="none"/>
+        </w:rPr>
+        <w:t>CXXFLAGS</w:t>
+      </w:r>
+      <w:r>
+        <w:rPr>
+          <w:rFonts w:ascii="Consolas" w:eastAsia="Times New Roman" w:hAnsi="Consolas" w:cs="Times New Roman"/>
+          <w:color w:val="CE9178"/>
+          <w:kern w:val="0"/>
+          <w:sz w:val="21"/>
+          <w:szCs w:val="21"/>
+          <w:lang w:bidi="gu-IN"/>
+          <w14:ligatures w14:val="none"/>
+        </w:rPr>
+        <w:t>)</w:t>
+      </w:r>
+      <w:r>
+        <w:rPr>
+          <w:rFonts w:ascii="Consolas" w:eastAsia="Times New Roman" w:hAnsi="Consolas" w:cs="Times New Roman"/>
+          <w:color w:val="CCCCCC"/>
+          <w:kern w:val="0"/>
+          <w:sz w:val="21"/>
+          <w:szCs w:val="21"/>
+          <w:lang w:bidi="gu-IN"/>
+          <w14:ligatures w14:val="none"/>
+        </w:rPr>
+        <w:t xml:space="preserve"> -c main.cpp -o </w:t>
+      </w:r>
+      <w:proofErr w:type="spellStart"/>
+      <w:proofErr w:type="gramStart"/>
+      <w:r>
+        <w:rPr>
+          <w:rFonts w:ascii="Consolas" w:eastAsia="Times New Roman" w:hAnsi="Consolas" w:cs="Times New Roman"/>
+          <w:color w:val="CCCCCC"/>
+          <w:kern w:val="0"/>
+          <w:sz w:val="21"/>
+          <w:szCs w:val="21"/>
+          <w:lang w:bidi="gu-IN"/>
+          <w14:ligatures w14:val="none"/>
+        </w:rPr>
+        <w:t>main.o</w:t>
+      </w:r>
+      <w:proofErr w:type="spellEnd"/>
+      <w:proofErr w:type="gramEnd"/>
+    </w:p>
+    <w:p>
+      <w:pPr>
+        <w:shd w:val="clear" w:color="auto" w:fill="1F1F1F"/>
+        <w:spacing w:after="0" w:line="285" w:lineRule="atLeast"/>
+        <w:rPr>
+          <w:rFonts w:ascii="Consolas" w:eastAsia="Times New Roman" w:hAnsi="Consolas" w:cs="Times New Roman"/>
+          <w:color w:val="CCCCCC"/>
+          <w:kern w:val="0"/>
+          <w:sz w:val="21"/>
+          <w:szCs w:val="21"/>
+          <w:lang w:bidi="gu-IN"/>
+          <w14:ligatures w14:val="none"/>
+        </w:rPr>
+      </w:pPr>
+    </w:p>
+    <w:p>
+      <w:pPr>
+        <w:shd w:val="clear" w:color="auto" w:fill="1F1F1F"/>
+        <w:spacing w:after="0" w:line="285" w:lineRule="atLeast"/>
+        <w:rPr>
+          <w:rFonts w:ascii="Consolas" w:eastAsia="Times New Roman" w:hAnsi="Consolas" w:cs="Times New Roman"/>
+          <w:color w:val="CCCCCC"/>
+          <w:kern w:val="0"/>
+          <w:sz w:val="21"/>
+          <w:szCs w:val="21"/>
+          <w:lang w:bidi="gu-IN"/>
+          <w14:ligatures w14:val="none"/>
+        </w:rPr>
+      </w:pPr>
+      <w:proofErr w:type="spellStart"/>
+      <w:proofErr w:type="gramStart"/>
+      <w:r>
+        <w:rPr>
+          <w:rFonts w:ascii="Consolas" w:eastAsia="Times New Roman" w:hAnsi="Consolas" w:cs="Times New Roman"/>
+          <w:color w:val="DCDCAA"/>
+          <w:kern w:val="0"/>
+          <w:sz w:val="21"/>
+          <w:szCs w:val="21"/>
+          <w:lang w:bidi="gu-IN"/>
+          <w14:ligatures w14:val="none"/>
+        </w:rPr>
+        <w:t>student.o</w:t>
+      </w:r>
+      <w:proofErr w:type="spellEnd"/>
+      <w:proofErr w:type="gramEnd"/>
+      <w:r>
+        <w:rPr>
+          <w:rFonts w:ascii="Consolas" w:eastAsia="Times New Roman" w:hAnsi="Consolas" w:cs="Times New Roman"/>
+          <w:color w:val="CCCCCC"/>
+          <w:kern w:val="0"/>
+          <w:sz w:val="21"/>
+          <w:szCs w:val="21"/>
+          <w:lang w:bidi="gu-IN"/>
+          <w14:ligatures w14:val="none"/>
+        </w:rPr>
+        <w:t xml:space="preserve">: student.cpp </w:t>
+      </w:r>
+      <w:proofErr w:type="spellStart"/>
+      <w:r>
+        <w:rPr>
+          <w:rFonts w:ascii="Consolas" w:eastAsia="Times New Roman" w:hAnsi="Consolas" w:cs="Times New Roman"/>
+          <w:color w:val="CCCCCC"/>
+          <w:kern w:val="0"/>
+          <w:sz w:val="21"/>
+          <w:szCs w:val="21"/>
+          <w:lang w:bidi="gu-IN"/>
+          <w14:ligatures w14:val="none"/>
+        </w:rPr>
+        <w:t>student.h</w:t>
+      </w:r>
+      <w:proofErr w:type="spellEnd"/>
+    </w:p>
+    <w:p>
+      <w:pPr>
+        <w:shd w:val="clear" w:color="auto" w:fill="1F1F1F"/>
+        <w:spacing w:after="0" w:line="285" w:lineRule="atLeast"/>
+        <w:rPr>
+          <w:rFonts w:ascii="Consolas" w:eastAsia="Times New Roman" w:hAnsi="Consolas" w:cs="Times New Roman"/>
+          <w:color w:val="CCCCCC"/>
+          <w:kern w:val="0"/>
+          <w:sz w:val="21"/>
+          <w:szCs w:val="21"/>
+          <w:lang w:bidi="gu-IN"/>
+          <w14:ligatures w14:val="none"/>
+        </w:rPr>
+      </w:pPr>
+      <w:r>
+        <w:rPr>
+          <w:rFonts w:ascii="Consolas" w:eastAsia="Times New Roman" w:hAnsi="Consolas" w:cs="Times New Roman"/>
+          <w:color w:val="CCCCCC"/>
+          <w:kern w:val="0"/>
+          <w:sz w:val="21"/>
+          <w:szCs w:val="21"/>
+          <w:lang w:bidi="gu-IN"/>
+          <w14:ligatures w14:val="none"/>
+        </w:rPr>
+        <w:t xml:space="preserve">    </w:t>
+      </w:r>
+      <w:r>
+        <w:rPr>
+          <w:rFonts w:ascii="Consolas" w:eastAsia="Times New Roman" w:hAnsi="Consolas" w:cs="Times New Roman"/>
+          <w:color w:val="CE9178"/>
+          <w:kern w:val="0"/>
+          <w:sz w:val="21"/>
+          <w:szCs w:val="21"/>
+          <w:lang w:bidi="gu-IN"/>
+          <w14:ligatures w14:val="none"/>
+        </w:rPr>
+        <w:t>$(</w:t>
+      </w:r>
+      <w:r>
+        <w:rPr>
+          <w:rFonts w:ascii="Consolas" w:eastAsia="Times New Roman" w:hAnsi="Consolas" w:cs="Times New Roman"/>
+          <w:color w:val="9CDCFE"/>
+          <w:kern w:val="0"/>
+          <w:sz w:val="21"/>
+          <w:szCs w:val="21"/>
+          <w:lang w:bidi="gu-IN"/>
+          <w14:ligatures w14:val="none"/>
+        </w:rPr>
+        <w:t>CXX</w:t>
+      </w:r>
+      <w:r>
+        <w:rPr>
+          <w:rFonts w:ascii="Consolas" w:eastAsia="Times New Roman" w:hAnsi="Consolas" w:cs="Times New Roman"/>
+          <w:color w:val="CE9178"/>
+          <w:kern w:val="0"/>
+          <w:sz w:val="21"/>
+          <w:szCs w:val="21"/>
+          <w:lang w:bidi="gu-IN"/>
+          <w14:ligatures w14:val="none"/>
+        </w:rPr>
+        <w:t>)</w:t>
+      </w:r>
+      <w:r>
+        <w:rPr>
+          <w:rFonts w:ascii="Consolas" w:eastAsia="Times New Roman" w:hAnsi="Consolas" w:cs="Times New Roman"/>
+          <w:color w:val="CCCCCC"/>
+          <w:kern w:val="0"/>
+          <w:sz w:val="21"/>
+          <w:szCs w:val="21"/>
+          <w:lang w:bidi="gu-IN"/>
+          <w14:ligatures w14:val="none"/>
+        </w:rPr>
+        <w:t xml:space="preserve"> </w:t>
+      </w:r>
+      <w:r>
+        <w:rPr>
+          <w:rFonts w:ascii="Consolas" w:eastAsia="Times New Roman" w:hAnsi="Consolas" w:cs="Times New Roman"/>
+          <w:color w:val="CE9178"/>
+          <w:kern w:val="0"/>
+          <w:sz w:val="21"/>
+          <w:szCs w:val="21"/>
+          <w:lang w:bidi="gu-IN"/>
+          <w14:ligatures w14:val="none"/>
+        </w:rPr>
+        <w:t>$(</w:t>
+      </w:r>
+      <w:r>
+        <w:rPr>
+          <w:rFonts w:ascii="Consolas" w:eastAsia="Times New Roman" w:hAnsi="Consolas" w:cs="Times New Roman"/>
+          <w:color w:val="9CDCFE"/>
+          <w:kern w:val="0"/>
+          <w:sz w:val="21"/>
+          <w:szCs w:val="21"/>
+          <w:lang w:bidi="gu-IN"/>
+          <w14:ligatures w14:val="none"/>
+        </w:rPr>
+        <w:t>CXXFLAGS</w:t>
+      </w:r>
+      <w:r>
+        <w:rPr>
+          <w:rFonts w:ascii="Consolas" w:eastAsia="Times New Roman" w:hAnsi="Consolas" w:cs="Times New Roman"/>
+          <w:color w:val="CE9178"/>
+          <w:kern w:val="0"/>
+          <w:sz w:val="21"/>
+          <w:szCs w:val="21"/>
+          <w:lang w:bidi="gu-IN"/>
+          <w14:ligatures w14:val="none"/>
+        </w:rPr>
+        <w:t>)</w:t>
+      </w:r>
+      <w:r>
+        <w:rPr>
+          <w:rFonts w:ascii="Consolas" w:eastAsia="Times New Roman" w:hAnsi="Consolas" w:cs="Times New Roman"/>
+          <w:color w:val="CCCCCC"/>
+          <w:kern w:val="0"/>
+          <w:sz w:val="21"/>
+          <w:szCs w:val="21"/>
+          <w:lang w:bidi="gu-IN"/>
+          <w14:ligatures w14:val="none"/>
+        </w:rPr>
+        <w:t xml:space="preserve"> -c student.cpp -o </w:t>
+      </w:r>
+      <w:proofErr w:type="spellStart"/>
+      <w:proofErr w:type="gramStart"/>
+      <w:r>
+        <w:rPr>
+          <w:rFonts w:ascii="Consolas" w:eastAsia="Times New Roman" w:hAnsi="Consolas" w:cs="Times New Roman"/>
+          <w:color w:val="CCCCCC"/>
+          <w:kern w:val="0"/>
+          <w:sz w:val="21"/>
+          <w:szCs w:val="21"/>
+          <w:lang w:bidi="gu-IN"/>
+          <w14:ligatures w14:val="none"/>
+        </w:rPr>
+        <w:t>student.o</w:t>
+      </w:r>
+      <w:proofErr w:type="spellEnd"/>
+      <w:proofErr w:type="gramEnd"/>
+    </w:p>
+    <w:p>
+      <w:pPr>
+        <w:shd w:val="clear" w:color="auto" w:fill="1F1F1F"/>
+        <w:spacing w:after="0" w:line="285" w:lineRule="atLeast"/>
+        <w:rPr>
+          <w:rFonts w:ascii="Consolas" w:eastAsia="Times New Roman" w:hAnsi="Consolas" w:cs="Times New Roman"/>
+          <w:color w:val="CCCCCC"/>
+          <w:kern w:val="0"/>
+          <w:sz w:val="21"/>
+          <w:szCs w:val="21"/>
+          <w:lang w:bidi="gu-IN"/>
+          <w14:ligatures w14:val="none"/>
+        </w:rPr>
+      </w:pPr>
+    </w:p>
+    <w:p>
+      <w:pPr>
+        <w:shd w:val="clear" w:color="auto" w:fill="1F1F1F"/>
+        <w:spacing w:after="0" w:line="285" w:lineRule="atLeast"/>
+        <w:rPr>
+          <w:rFonts w:ascii="Consolas" w:eastAsia="Times New Roman" w:hAnsi="Consolas" w:cs="Times New Roman"/>
+          <w:color w:val="CCCCCC"/>
+          <w:kern w:val="0"/>
+          <w:sz w:val="21"/>
+          <w:szCs w:val="21"/>
+          <w:lang w:bidi="gu-IN"/>
+          <w14:ligatures w14:val="none"/>
+        </w:rPr>
+      </w:pPr>
+      <w:r>
+        <w:rPr>
+          <w:rFonts w:ascii="Consolas" w:eastAsia="Times New Roman" w:hAnsi="Consolas" w:cs="Times New Roman"/>
+          <w:color w:val="DCDCAA"/>
+          <w:kern w:val="0"/>
+          <w:sz w:val="21"/>
+          <w:szCs w:val="21"/>
+          <w:lang w:bidi="gu-IN"/>
+          <w14:ligatures w14:val="none"/>
+        </w:rPr>
+        <w:t>clean</w:t>
+      </w:r>
+      <w:r>
+        <w:rPr>
+          <w:rFonts w:ascii="Consolas" w:eastAsia="Times New Roman" w:hAnsi="Consolas" w:cs="Times New Roman"/>
+          <w:color w:val="CCCCCC"/>
+          <w:kern w:val="0"/>
+          <w:sz w:val="21"/>
+          <w:szCs w:val="21"/>
+          <w:lang w:bidi="gu-IN"/>
+          <w14:ligatures w14:val="none"/>
+        </w:rPr>
+        <w:t>:</w:t>
+      </w:r>
+    </w:p>
+    <w:p>
+      <w:pPr>
+        <w:shd w:val="clear" w:color="auto" w:fill="1F1F1F"/>
+        <w:spacing w:after="0" w:line="285" w:lineRule="atLeast"/>
+        <w:rPr>
+          <w:rFonts w:ascii="Consolas" w:eastAsia="Times New Roman" w:hAnsi="Consolas" w:cs="Times New Roman"/>
+          <w:color w:val="CCCCCC"/>
+          <w:kern w:val="0"/>
+          <w:sz w:val="21"/>
+          <w:szCs w:val="21"/>
+          <w:lang w:bidi="gu-IN"/>
+          <w14:ligatures w14:val="none"/>
+        </w:rPr>
+      </w:pPr>
+      <w:r>
+        <w:rPr>
+          <w:rFonts w:ascii="Consolas" w:eastAsia="Times New Roman" w:hAnsi="Consolas" w:cs="Times New Roman"/>
+          <w:color w:val="CCCCCC"/>
+          <w:kern w:val="0"/>
+          <w:sz w:val="21"/>
+          <w:szCs w:val="21"/>
+          <w:lang w:bidi="gu-IN"/>
+          <w14:ligatures w14:val="none"/>
+        </w:rPr>
+        <w:t xml:space="preserve">    rm -f </w:t>
+      </w:r>
+      <w:r>
+        <w:rPr>
+          <w:rFonts w:ascii="Consolas" w:eastAsia="Times New Roman" w:hAnsi="Consolas" w:cs="Times New Roman"/>
+          <w:color w:val="CE9178"/>
+          <w:kern w:val="0"/>
+          <w:sz w:val="21"/>
+          <w:szCs w:val="21"/>
+          <w:lang w:bidi="gu-IN"/>
+          <w14:ligatures w14:val="none"/>
+        </w:rPr>
+        <w:t>$(</w:t>
+      </w:r>
+      <w:r>
+        <w:rPr>
+          <w:rFonts w:ascii="Consolas" w:eastAsia="Times New Roman" w:hAnsi="Consolas" w:cs="Times New Roman"/>
+          <w:color w:val="9CDCFE"/>
+          <w:kern w:val="0"/>
+          <w:sz w:val="21"/>
+          <w:szCs w:val="21"/>
+          <w:lang w:bidi="gu-IN"/>
+          <w14:ligatures w14:val="none"/>
+        </w:rPr>
+        <w:t>OBJS</w:t>
+      </w:r>
+      <w:r>
+        <w:rPr>
+          <w:rFonts w:ascii="Consolas" w:eastAsia="Times New Roman" w:hAnsi="Consolas" w:cs="Times New Roman"/>
+          <w:color w:val="CE9178"/>
+          <w:kern w:val="0"/>
+          <w:sz w:val="21"/>
+          <w:szCs w:val="21"/>
+          <w:lang w:bidi="gu-IN"/>
+          <w14:ligatures w14:val="none"/>
+        </w:rPr>
+        <w:t>)</w:t>
+      </w:r>
+      <w:r>
+        <w:rPr>
+          <w:rFonts w:ascii="Consolas" w:eastAsia="Times New Roman" w:hAnsi="Consolas" w:cs="Times New Roman"/>
+          <w:color w:val="CCCCCC"/>
+          <w:kern w:val="0"/>
+          <w:sz w:val="21"/>
+          <w:szCs w:val="21"/>
+          <w:lang w:bidi="gu-IN"/>
+          <w14:ligatures w14:val="none"/>
+        </w:rPr>
+        <w:t xml:space="preserve"> </w:t>
+      </w:r>
+      <w:r>
+        <w:rPr>
+          <w:rFonts w:ascii="Consolas" w:eastAsia="Times New Roman" w:hAnsi="Consolas" w:cs="Times New Roman"/>
+          <w:color w:val="CE9178"/>
+          <w:kern w:val="0"/>
+          <w:sz w:val="21"/>
+          <w:szCs w:val="21"/>
+          <w:lang w:bidi="gu-IN"/>
+          <w14:ligatures w14:val="none"/>
+        </w:rPr>
+        <w:t>$(</w:t>
+      </w:r>
+      <w:r>
+        <w:rPr>
+          <w:rFonts w:ascii="Consolas" w:eastAsia="Times New Roman" w:hAnsi="Consolas" w:cs="Times New Roman"/>
+          <w:color w:val="9CDCFE"/>
+          <w:kern w:val="0"/>
+          <w:sz w:val="21"/>
+          <w:szCs w:val="21"/>
+          <w:lang w:bidi="gu-IN"/>
+          <w14:ligatures w14:val="none"/>
+        </w:rPr>
+        <w:t>TARGET</w:t>
+      </w:r>
+      <w:r>
+        <w:rPr>
+          <w:rFonts w:ascii="Consolas" w:eastAsia="Times New Roman" w:hAnsi="Consolas" w:cs="Times New Roman"/>
+          <w:color w:val="CE9178"/>
+          <w:kern w:val="0"/>
+          <w:sz w:val="21"/>
+          <w:szCs w:val="21"/>
+          <w:lang w:bidi="gu-IN"/>
+          <w14:ligatures w14:val="none"/>
+        </w:rPr>
+        <w:t>)</w:t>
+      </w:r>
+    </w:p>
+    <w:p>
+      <w:pPr>
+        <w:rPr>
+          <w:b/>
+          <w:bCs/>
+          <w:sz w:val="22"/>
+          <w:szCs w:val="24"/>
+        </w:rPr>
+      </w:pPr>
+    </w:p>
+    <w:p>
+      <w:pPr>
         <w:pBdr>
           <w:bottom w:val="single" w:sz="6" w:space="1" w:color="auto"/>
         </w:pBdr>
@@ -2468,7 +3568,6 @@
           <w:sz w:val="22"/>
           <w:szCs w:val="24"/>
         </w:rPr>
-        <w:lastRenderedPageBreak/>
         <w:t>What to do</w:t>
       </w:r>
     </w:p>
@@ -2688,6 +3787,7 @@
           <w:sz w:val="22"/>
           <w:szCs w:val="24"/>
         </w:rPr>
+        <w:lastRenderedPageBreak/>
         <w:drawing>
           <wp:inline distT="0" distB="0" distL="0" distR="0" wp14:anchorId="742B7296" wp14:editId="3CFA0C98">
             <wp:extent cx="5943600" cy="3172460"/>

</xml_diff>